<commit_message>
Refine poster color styling and appearance
- Lightened light blue background colors for subtle appearance
- Reduced box border thickness for cleaner look
- Updated table headers with very light blue background
- Ensured proper color hierarchy: red borders/dividers, blue title
- Updated both PDF and formatted DOCX versions

Co-authored-by: Copilot <223556219+Copilot@users.noreply.github.com>
</commit_message>
<xml_diff>
--- a/Poster/poster_formatted.docx
+++ b/Poster/poster_formatted.docx
@@ -952,7 +952,7 @@
       </w:tr>
       <w:tr>
         <w:trPr>
-          <w:trHeight w:hRule="exact" w:val="2796"/>
+          <w:trHeight w:hRule="exact" w:val="2776"/>
         </w:trPr>
         <w:tc>
           <w:tcPr>
@@ -1054,7 +1054,7 @@
             </w:tblGrid>
             <w:tr>
               <w:trPr>
-                <w:trHeight w:hRule="exact" w:val="424"/>
+                <w:trHeight w:hRule="exact" w:val="414"/>
               </w:trPr>
               <w:tc>
                 <w:tcPr>
@@ -1071,8 +1071,8 @@
                     <w:autoSpaceDN w:val="0"/>
                     <w:autoSpaceDE w:val="0"/>
                     <w:widowControl/>
-                    <w:spacing w:line="286" w:lineRule="exact" w:before="120" w:after="0"/>
-                    <w:ind w:left="156" w:right="0" w:firstLine="0"/>
+                    <w:spacing w:line="286" w:lineRule="exact" w:before="110" w:after="0"/>
+                    <w:ind w:left="146" w:right="0" w:firstLine="0"/>
                     <w:jc w:val="left"/>
                   </w:pPr>
                   <w:r>
@@ -1104,7 +1104,7 @@
               <w:tblW w:type="auto" w:w="0"/>
               <w:tblLayout w:type="fixed"/>
               <w:tblLook w:firstColumn="1" w:firstRow="1" w:lastColumn="0" w:lastRow="0" w:noHBand="0" w:noVBand="1" w:val="04A0"/>
-              <w:tblInd w:w="20.0" w:type="dxa"/>
+              <w:tblInd w:w="10.0" w:type="dxa"/>
             </w:tblPr>
             <w:tblGrid>
               <w:gridCol w:w="8726"/>
@@ -1115,7 +1115,7 @@
               </w:trPr>
               <w:tc>
                 <w:tcPr>
-                  <w:tcW w:type="dxa" w:w="8686"/>
+                  <w:tcW w:type="dxa" w:w="8706"/>
                   <w:tcBorders/>
                   <w:shd w:fill="004b99"/>
                   <w:tcMar>
@@ -1183,7 +1183,7 @@
               <w:tblW w:type="auto" w:w="0"/>
               <w:tblLayout w:type="fixed"/>
               <w:tblLook w:firstColumn="1" w:firstRow="1" w:lastColumn="0" w:lastRow="0" w:noHBand="0" w:noVBand="1" w:val="04A0"/>
-              <w:tblInd w:w="20.0" w:type="dxa"/>
+              <w:tblInd w:w="10.0" w:type="dxa"/>
             </w:tblPr>
             <w:tblGrid>
               <w:gridCol w:w="8726"/>
@@ -1194,7 +1194,7 @@
               </w:trPr>
               <w:tc>
                 <w:tcPr>
-                  <w:tcW w:type="dxa" w:w="8686"/>
+                  <w:tcW w:type="dxa" w:w="8706"/>
                   <w:tcBorders/>
                   <w:shd w:fill="004b99"/>
                   <w:tcMar>
@@ -1283,7 +1283,7 @@
               <w:tblW w:type="auto" w:w="0"/>
               <w:tblLayout w:type="fixed"/>
               <w:tblLook w:firstColumn="1" w:firstRow="1" w:lastColumn="0" w:lastRow="0" w:noHBand="0" w:noVBand="1" w:val="04A0"/>
-              <w:tblInd w:w="20.0" w:type="dxa"/>
+              <w:tblInd w:w="10.0" w:type="dxa"/>
             </w:tblPr>
             <w:tblGrid>
               <w:gridCol w:w="8726"/>
@@ -1294,7 +1294,7 @@
               </w:trPr>
               <w:tc>
                 <w:tcPr>
-                  <w:tcW w:type="dxa" w:w="8686"/>
+                  <w:tcW w:type="dxa" w:w="8706"/>
                   <w:tcBorders/>
                   <w:shd w:fill="004b99"/>
                   <w:tcMar>
@@ -1383,7 +1383,7 @@
               <w:tblW w:type="auto" w:w="0"/>
               <w:tblLayout w:type="fixed"/>
               <w:tblLook w:firstColumn="1" w:firstRow="1" w:lastColumn="0" w:lastRow="0" w:noHBand="0" w:noVBand="1" w:val="04A0"/>
-              <w:tblInd w:w="20.0" w:type="dxa"/>
+              <w:tblInd w:w="10.0" w:type="dxa"/>
             </w:tblPr>
             <w:tblGrid>
               <w:gridCol w:w="8726"/>
@@ -1394,7 +1394,7 @@
               </w:trPr>
               <w:tc>
                 <w:tcPr>
-                  <w:tcW w:type="dxa" w:w="8686"/>
+                  <w:tcW w:type="dxa" w:w="8706"/>
                   <w:tcBorders/>
                   <w:shd w:fill="004b99"/>
                   <w:tcMar>
@@ -1475,7 +1475,7 @@
       </w:tr>
       <w:tr>
         <w:trPr>
-          <w:trHeight w:hRule="exact" w:val="2924"/>
+          <w:trHeight w:hRule="exact" w:val="2944"/>
         </w:trPr>
         <w:tc>
           <w:tcPr>
@@ -1500,13 +1500,13 @@
             <w:pPr>
               <w:autoSpaceDN w:val="0"/>
               <w:tabs>
-                <w:tab w:pos="216" w:val="left"/>
-                <w:tab w:pos="494" w:val="left"/>
+                <w:tab w:pos="206" w:val="left"/>
+                <w:tab w:pos="484" w:val="left"/>
               </w:tabs>
               <w:autoSpaceDE w:val="0"/>
               <w:widowControl/>
-              <w:spacing w:line="358" w:lineRule="exact" w:before="416" w:after="0"/>
-              <w:ind w:left="156" w:right="144" w:firstLine="0"/>
+              <w:spacing w:line="358" w:lineRule="exact" w:before="406" w:after="0"/>
+              <w:ind w:left="146" w:right="144" w:firstLine="0"/>
               <w:jc w:val="left"/>
             </w:pPr>
             <w:r>
@@ -1578,12 +1578,12 @@
             <w:pPr>
               <w:autoSpaceDN w:val="0"/>
               <w:tabs>
-                <w:tab w:pos="494" w:val="left"/>
+                <w:tab w:pos="484" w:val="left"/>
               </w:tabs>
               <w:autoSpaceDE w:val="0"/>
               <w:widowControl/>
-              <w:spacing w:line="332" w:lineRule="exact" w:before="32" w:after="0"/>
-              <w:ind w:left="216" w:right="144" w:firstLine="0"/>
+              <w:spacing w:line="332" w:lineRule="exact" w:before="30" w:after="0"/>
+              <w:ind w:left="206" w:right="144" w:firstLine="0"/>
               <w:jc w:val="left"/>
             </w:pPr>
             <w:r>
@@ -1797,7 +1797,7 @@
                     <w:end w:sz="3.184000015258789" w:val="single" w:color="#000000"/>
                     <w:bottom w:sz="3.184000015258789" w:val="single" w:color="#000000"/>
                   </w:tcBorders>
-                  <w:shd w:fill="dcebf4"/>
+                  <w:shd w:fill="f4faff"/>
                   <w:tcMar>
                     <w:start w:w="0" w:type="dxa"/>
                     <w:end w:w="0" w:type="dxa"/>
@@ -1834,7 +1834,6 @@
                     <w:end w:sz="3.184000015258789" w:val="single" w:color="#000000"/>
                     <w:bottom w:sz="3.184000015258789" w:val="single" w:color="#000000"/>
                   </w:tcBorders>
-                  <w:shd w:fill="dcebf4"/>
                   <w:tcMar>
                     <w:start w:w="0" w:type="dxa"/>
                     <w:end w:w="0" w:type="dxa"/>
@@ -1876,7 +1875,7 @@
                     <w:end w:sz="3.184000015258789" w:val="single" w:color="#000000"/>
                     <w:bottom w:sz="3.184000015258789" w:val="single" w:color="#000000"/>
                   </w:tcBorders>
-                  <w:shd w:fill="dcebf4"/>
+                  <w:shd w:fill="f4faff"/>
                   <w:tcMar>
                     <w:start w:w="0" w:type="dxa"/>
                     <w:end w:w="0" w:type="dxa"/>
@@ -1913,7 +1912,6 @@
                     <w:end w:sz="3.184000015258789" w:val="single" w:color="#000000"/>
                     <w:bottom w:sz="3.184000015258789" w:val="single" w:color="#000000"/>
                   </w:tcBorders>
-                  <w:shd w:fill="dcebf4"/>
                   <w:tcMar>
                     <w:start w:w="0" w:type="dxa"/>
                     <w:end w:w="0" w:type="dxa"/>
@@ -1955,7 +1953,7 @@
                     <w:end w:sz="3.184000015258789" w:val="single" w:color="#000000"/>
                     <w:bottom w:sz="3.184000015258789" w:val="single" w:color="#000000"/>
                   </w:tcBorders>
-                  <w:shd w:fill="dcebf4"/>
+                  <w:shd w:fill="f4faff"/>
                   <w:tcMar>
                     <w:start w:w="0" w:type="dxa"/>
                     <w:end w:w="0" w:type="dxa"/>
@@ -1992,7 +1990,6 @@
                     <w:end w:sz="3.184000015258789" w:val="single" w:color="#000000"/>
                     <w:bottom w:sz="3.184000015258789" w:val="single" w:color="#000000"/>
                   </w:tcBorders>
-                  <w:shd w:fill="dcebf4"/>
                   <w:tcMar>
                     <w:start w:w="0" w:type="dxa"/>
                     <w:end w:w="0" w:type="dxa"/>
@@ -2034,7 +2031,7 @@
                     <w:end w:sz="3.184000015258789" w:val="single" w:color="#000000"/>
                     <w:bottom w:sz="3.184000015258789" w:val="single" w:color="#000000"/>
                   </w:tcBorders>
-                  <w:shd w:fill="dcebf4"/>
+                  <w:shd w:fill="f4faff"/>
                   <w:tcMar>
                     <w:start w:w="0" w:type="dxa"/>
                     <w:end w:w="0" w:type="dxa"/>
@@ -2071,7 +2068,6 @@
                     <w:end w:sz="3.184000015258789" w:val="single" w:color="#000000"/>
                     <w:bottom w:sz="3.184000015258789" w:val="single" w:color="#000000"/>
                   </w:tcBorders>
-                  <w:shd w:fill="dcebf4"/>
                   <w:tcMar>
                     <w:start w:w="0" w:type="dxa"/>
                     <w:end w:w="0" w:type="dxa"/>
@@ -2113,7 +2109,7 @@
                     <w:end w:sz="3.184000015258789" w:val="single" w:color="#000000"/>
                     <w:bottom w:sz="3.184000015258789" w:val="single" w:color="#000000"/>
                   </w:tcBorders>
-                  <w:shd w:fill="dcebf4"/>
+                  <w:shd w:fill="f4faff"/>
                   <w:tcMar>
                     <w:start w:w="0" w:type="dxa"/>
                     <w:end w:w="0" w:type="dxa"/>
@@ -2150,7 +2146,6 @@
                     <w:end w:sz="3.184000015258789" w:val="single" w:color="#000000"/>
                     <w:bottom w:sz="3.184000015258789" w:val="single" w:color="#000000"/>
                   </w:tcBorders>
-                  <w:shd w:fill="dcebf4"/>
                   <w:tcMar>
                     <w:start w:w="0" w:type="dxa"/>
                     <w:end w:w="0" w:type="dxa"/>

</xml_diff>